<commit_message>
fix: render code blocks as real monospace code in docx/pdf export
</commit_message>
<xml_diff>
--- a/src/pages/exporter_data/reference-entreprise.docx
+++ b/src/pages/exporter_data/reference-entreprise.docx
@@ -1271,6 +1271,27 @@
     </w:pPr>
     <w:rPr>
       <w:color w:val="7A520A"/>
+    </w:rPr>
+  </w:style>
+  <w:style w:type="paragraph" w:customStyle="1" w:styleId="SourceCode">
+    <w:name w:val="Source Code"/>
+    <w:basedOn w:val="Normal"/>
+    <w:pPr>
+      <w:keepLines/>
+      <w:spacing w:line="240" w:lineRule="auto" w:before="80" w:after="160"/>
+      <w:jc w:val="left"/>
+      <w:pBdr>
+        <w:top w:val="single" w:sz="4" w:space="6" w:color="DDE1E6"/>
+        <w:bottom w:val="single" w:sz="4" w:space="6" w:color="DDE1E6"/>
+        <w:left w:val="single" w:sz="4" w:space="6" w:color="DDE1E6"/>
+        <w:right w:val="single" w:sz="4" w:space="6" w:color="DDE1E6"/>
+      </w:pBdr>
+      <w:shd w:val="clear" w:color="auto" w:fill="F4F5F7"/>
+    </w:pPr>
+    <w:rPr>
+      <w:rFonts w:ascii="Consolas" w:hAnsi="Consolas"/>
+      <w:color w:val="333A40"/>
+      <w:sz w:val="19"/>
     </w:rPr>
   </w:style>
 </w:styles>

</xml_diff>

<commit_message>
feat: render export code blocks as a two-tone header/body card
</commit_message>
<xml_diff>
--- a/src/pages/exporter_data/reference-entreprise.docx
+++ b/src/pages/exporter_data/reference-entreprise.docx
@@ -1273,15 +1273,36 @@
       <w:color w:val="7A520A"/>
     </w:rPr>
   </w:style>
-  <w:style w:type="paragraph" w:customStyle="1" w:styleId="SourceCode">
-    <w:name w:val="Source Code"/>
-    <w:basedOn w:val="Normal"/>
-    <w:pPr>
-      <w:keepLines/>
-      <w:spacing w:line="240" w:lineRule="auto" w:before="80" w:after="160"/>
+  <w:style w:type="paragraph" w:customStyle="1" w:styleId="CodeLabel">
+    <w:name w:val="Code Label"/>
+    <w:basedOn w:val="Normal"/>
+    <w:pPr>
+      <w:keepNext/>
+      <w:spacing w:line="240" w:lineRule="auto" w:before="160" w:after="0"/>
       <w:jc w:val="left"/>
       <w:pBdr>
         <w:top w:val="single" w:sz="4" w:space="6" w:color="DDE1E6"/>
+        <w:left w:val="single" w:sz="4" w:space="6" w:color="DDE1E6"/>
+        <w:right w:val="single" w:sz="4" w:space="6" w:color="DDE1E6"/>
+        <w:bottom w:val="single" w:sz="4" w:space="6" w:color="DDE1E6"/>
+      </w:pBdr>
+      <w:shd w:val="clear" w:color="auto" w:fill="33383E"/>
+    </w:pPr>
+    <w:rPr>
+      <w:rFonts w:ascii="Consolas" w:hAnsi="Consolas"/>
+      <w:b/>
+      <w:color w:val="E8EBEE"/>
+      <w:sz w:val="16"/>
+    </w:rPr>
+  </w:style>
+  <w:style w:type="paragraph" w:customStyle="1" w:styleId="SourceCode">
+    <w:name w:val="Source Code"/>
+    <w:basedOn w:val="Normal"/>
+    <w:pPr>
+      <w:keepLines/>
+      <w:spacing w:line="240" w:lineRule="auto" w:before="0" w:after="160"/>
+      <w:jc w:val="left"/>
+      <w:pBdr>
         <w:bottom w:val="single" w:sz="4" w:space="6" w:color="DDE1E6"/>
         <w:left w:val="single" w:sz="4" w:space="6" w:color="DDE1E6"/>
         <w:right w:val="single" w:sz="4" w:space="6" w:color="DDE1E6"/>

</xml_diff>

<commit_message>
feat: render note/warning admonitions as two-tone cards in export
</commit_message>
<xml_diff>
--- a/src/pages/exporter_data/reference-entreprise.docx
+++ b/src/pages/exporter_data/reference-entreprise.docx
@@ -1243,31 +1243,73 @@
       <w:color w:val="7A45B0"/>
     </w:rPr>
   </w:style>
+  <w:style w:type="paragraph" w:customStyle="1" w:styleId="EncadréNoteTitre">
+    <w:name w:val="Encadré Note Titre"/>
+    <w:basedOn w:val="Normal"/>
+    <w:pPr>
+      <w:keepNext/>
+      <w:spacing w:before="160" w:after="0"/>
+      <w:jc w:val="left"/>
+      <w:pBdr>
+        <w:top w:val="single" w:sz="4" w:space="6" w:color="C4DBF0"/>
+        <w:left w:val="single" w:sz="4" w:space="6" w:color="C4DBF0"/>
+        <w:right w:val="single" w:sz="4" w:space="6" w:color="C4DBF0"/>
+        <w:bottom w:val="single" w:sz="4" w:space="6" w:color="C4DBF0"/>
+      </w:pBdr>
+      <w:shd w:val="clear" w:color="auto" w:fill="1F5A8F"/>
+    </w:pPr>
+    <w:rPr>
+      <w:b/>
+      <w:color w:val="EAF1F8"/>
+    </w:rPr>
+  </w:style>
   <w:style w:type="paragraph" w:customStyle="1" w:styleId="EncadréNote">
     <w:name w:val="Encadré Note"/>
     <w:basedOn w:val="Normal"/>
     <w:pPr>
-      <w:spacing w:before="120" w:after="120"/>
-      <w:ind w:left="240"/>
+      <w:spacing w:before="0" w:after="160"/>
+      <w:pBdr>
+        <w:left w:val="single" w:sz="4" w:space="6" w:color="C4DBF0"/>
+        <w:right w:val="single" w:sz="4" w:space="6" w:color="C4DBF0"/>
+        <w:bottom w:val="single" w:sz="4" w:space="6" w:color="C4DBF0"/>
+      </w:pBdr>
       <w:shd w:val="clear" w:color="auto" w:fill="EAF1F8"/>
+    </w:pPr>
+    <w:rPr>
+      <w:color w:val="333A40"/>
+    </w:rPr>
+  </w:style>
+  <w:style w:type="paragraph" w:customStyle="1" w:styleId="EncadréWarningTitre">
+    <w:name w:val="Encadré Warning Titre"/>
+    <w:basedOn w:val="Normal"/>
+    <w:pPr>
+      <w:keepNext/>
+      <w:spacing w:before="160" w:after="0"/>
+      <w:jc w:val="left"/>
       <w:pBdr>
-        <w:left w:val="single" w:sz="24" w:space="10" w:color="2A6DB3"/>
+        <w:top w:val="single" w:sz="4" w:space="6" w:color="E6D28C"/>
+        <w:left w:val="single" w:sz="4" w:space="6" w:color="E6D28C"/>
+        <w:right w:val="single" w:sz="4" w:space="6" w:color="E6D28C"/>
+        <w:bottom w:val="single" w:sz="4" w:space="6" w:color="E6D28C"/>
       </w:pBdr>
-    </w:pPr>
-    <w:rPr>
-      <w:color w:val="333A40"/>
+      <w:shd w:val="clear" w:color="auto" w:fill="8A6A10"/>
+    </w:pPr>
+    <w:rPr>
+      <w:b/>
+      <w:color w:val="FDF3DD"/>
     </w:rPr>
   </w:style>
   <w:style w:type="paragraph" w:customStyle="1" w:styleId="EncadréWarning">
     <w:name w:val="Encadré Warning"/>
     <w:basedOn w:val="Normal"/>
     <w:pPr>
-      <w:spacing w:before="120" w:after="120"/>
-      <w:ind w:left="240"/>
+      <w:spacing w:before="0" w:after="160"/>
+      <w:pBdr>
+        <w:left w:val="single" w:sz="4" w:space="6" w:color="E6D28C"/>
+        <w:right w:val="single" w:sz="4" w:space="6" w:color="E6D28C"/>
+        <w:bottom w:val="single" w:sz="4" w:space="6" w:color="E6D28C"/>
+      </w:pBdr>
       <w:shd w:val="clear" w:color="auto" w:fill="FDF3DD"/>
-      <w:pBdr>
-        <w:left w:val="single" w:sz="24" w:space="10" w:color="C9A227"/>
-      </w:pBdr>
     </w:pPr>
     <w:rPr>
       <w:color w:val="7A520A"/>

</xml_diff>